<commit_message>
Add MIT license, welcome contributors, link repo in submission doc
- LICENSE (MIT)
- Soften NOTICE.md to keep only the academic-integrity note
- README: Contributing and License sections
- Submission .docx: add project repository link under the author line
</commit_message>
<xml_diff>
--- a/docs/submission/Agentic-Expense-Reporting-System-Mayur-Hulke.docx
+++ b/docs/submission/Agentic-Expense-Reporting-System-Mayur-Hulke.docx
@@ -89,6 +89,11 @@
           <w:rtl w:val="0"/>
         </w:rPr>
         <w:t>Mayur Hulke</w:t>
+      </w:r>
+    </w:p>
+    <w:p>
+      <w:r>
+        <w:t>Project repository: https://github.com/MayurHulke/agentic-expense-reporting</w:t>
       </w:r>
     </w:p>
     <w:p>

</xml_diff>

<commit_message>
Add rendered system-flow diagram (png/svg/mmd) and embed it in the submission doc
</commit_message>
<xml_diff>
--- a/docs/submission/Agentic-Expense-Reporting-System-Mayur-Hulke.docx
+++ b/docs/submission/Agentic-Expense-Reporting-System-Mayur-Hulke.docx
@@ -20,29 +20,181 @@
           <w:sz w:val="88"/>
           <w:szCs w:val="88"/>
         </w:rPr>
+      </w:r>
+      <w:r>
+        <w:rPr>
+          <w:rFonts w:ascii="Open Sans Light" w:cs="Open Sans Light" w:eastAsia="Open Sans Light" w:hAnsi="Open Sans Light"/>
+          <w:sz w:val="88"/>
+          <w:szCs w:val="88"/>
+          <w:rtl w:val="0"/>
+        </w:rPr>
+        <w:t xml:space="preserve">Agentic Expense Reporting System</w:t>
+      </w:r>
+    </w:p>
+    <w:p>
+      <w:pPr>
+        <w:rPr>
+          <w:color w:val="ff0000"/>
+        </w:rPr>
+      </w:pPr>
+      <w:r>
+        <w:rPr>
+          <w:rtl w:val="0"/>
+        </w:rPr>
+        <w:t xml:space="preserve">Presented by: </w:t>
+      </w:r>
+      <w:r>
+        <w:rPr>
+          <w:color w:val="ff0000"/>
+          <w:rtl w:val="0"/>
+        </w:rPr>
+        <w:t>Mayur Hulke</w:t>
+      </w:r>
+    </w:p>
+    <w:p>
+      <w:r>
+        <w:t>Project repository: https://github.com/MayurHulke/agentic-expense-reporting</w:t>
+      </w:r>
+    </w:p>
+    <w:p>
+      <w:pPr>
+        <w:rPr>
+          <w:rFonts w:ascii="Open Sans" w:cs="Open Sans" w:eastAsia="Open Sans" w:hAnsi="Open Sans"/>
+        </w:rPr>
+      </w:pPr>
+      <w:r>
+        <w:rPr>
+          <w:rFonts w:ascii="Open Sans" w:cs="Open Sans" w:eastAsia="Open Sans" w:hAnsi="Open Sans"/>
+        </w:rPr>
+        <mc:AlternateContent>
+          <mc:Choice Requires="wpg"/>
+          <mc:Fallback/>
+        </mc:AlternateContent>
+      </w:r>
+      <w:r>
+        <w:rPr>
+          <w:rtl w:val="0"/>
+        </w:rPr>
+      </w:r>
+    </w:p>
+    <w:p>
+      <w:pPr>
+        <w:pStyle w:val="Heading1"/>
+        <w:spacing w:after="0" w:before="0" w:lineRule="auto"/>
+        <w:rPr>
+          <w:rFonts w:ascii="Open Sans SemiBold" w:cs="Open Sans SemiBold" w:eastAsia="Open Sans SemiBold" w:hAnsi="Open Sans SemiBold"/>
+          <w:sz w:val="34"/>
+          <w:szCs w:val="34"/>
+        </w:rPr>
+      </w:pPr>
+      <w:bookmarkStart w:colFirst="0" w:colLast="0" w:name="_7pqs3h2m85w" w:id="1"/>
+      <w:bookmarkEnd w:id="1"/>
+      <w:r>
+        <w:rPr>
+          <w:rFonts w:ascii="Open Sans SemiBold" w:cs="Open Sans SemiBold" w:eastAsia="Open Sans SemiBold" w:hAnsi="Open Sans SemiBold"/>
+          <w:color w:val="ffffff"/>
+          <w:sz w:val="24"/>
+          <w:szCs w:val="24"/>
+          <w:highlight w:val="black"/>
+          <w:rtl w:val="0"/>
+        </w:rPr>
+        <w:t xml:space="preserve"> STEP 1: </w:t>
+      </w:r>
+      <w:r>
+        <w:rPr>
+          <w:rFonts w:ascii="Open Sans SemiBold" w:cs="Open Sans SemiBold" w:eastAsia="Open Sans SemiBold" w:hAnsi="Open Sans SemiBold"/>
+          <w:color w:val="02b3e4"/>
+          <w:sz w:val="24"/>
+          <w:szCs w:val="24"/>
+          <w:rtl w:val="0"/>
+        </w:rPr>
+        <w:t xml:space="preserve"> </w:t>
+      </w:r>
+      <w:r>
+        <w:rPr>
+          <w:rFonts w:ascii="Open Sans SemiBold" w:cs="Open Sans SemiBold" w:eastAsia="Open Sans SemiBold" w:hAnsi="Open Sans SemiBold"/>
+          <w:sz w:val="34"/>
+          <w:szCs w:val="34"/>
+          <w:rtl w:val="0"/>
+        </w:rPr>
+        <w:t xml:space="preserve">Review the Current System Documentation</w:t>
+      </w:r>
+    </w:p>
+    <w:p>
+      <w:pPr>
+        <w:rPr/>
+      </w:pPr>
+      <w:r>
+        <w:rPr>
+          <w:rtl w:val="0"/>
+        </w:rPr>
+        <w:t xml:space="preserve">No written response needed.</w:t>
+      </w:r>
+      <w:r>
+        <w:rPr>
+          <w:rtl w:val="0"/>
+        </w:rPr>
+      </w:r>
+    </w:p>
+    <w:p>
+      <w:pPr>
+        <w:pStyle w:val="Heading1"/>
+        <w:spacing w:after="0" w:before="0" w:lineRule="auto"/>
+        <w:rPr>
+          <w:rFonts w:ascii="Open Sans SemiBold" w:cs="Open Sans SemiBold" w:eastAsia="Open Sans SemiBold" w:hAnsi="Open Sans SemiBold"/>
+          <w:color w:val="ffffff"/>
+          <w:sz w:val="24"/>
+          <w:szCs w:val="24"/>
+          <w:highlight w:val="black"/>
+        </w:rPr>
+      </w:pPr>
+      <w:bookmarkStart w:colFirst="0" w:colLast="0" w:name="_m5nw8ml1n451" w:id="2"/>
+      <w:bookmarkEnd w:id="2"/>
+      <w:r>
+        <w:rPr>
+          <w:rtl w:val="0"/>
+        </w:rPr>
+      </w:r>
+    </w:p>
+    <w:p>
+      <w:pPr>
+        <w:rPr/>
+      </w:pPr>
+      <w:r>
+        <w:rPr>
+          <w:rtl w:val="0"/>
+        </w:rPr>
+      </w:r>
+    </w:p>
+    <w:p>
+      <w:pPr>
+        <w:jc w:val="center"/>
+      </w:pPr>
+      <w:r>
+        <w:t>Figure 1: System flow. Validation gate = Step 2 fix, human review = Step 3, residency = Step 4, dual-department = Step 5.</w:t>
+      </w:r>
+    </w:p>
+    <w:p>
+      <w:pPr>
+        <w:jc w:val="center"/>
+      </w:pPr>
+      <w:r>
         <w:drawing>
-          <wp:anchor allowOverlap="1" behindDoc="1" distB="114300" distT="114300" distL="114300" distR="114300" hidden="0" layoutInCell="1" locked="0" relativeHeight="0" simplePos="0">
-            <wp:simplePos x="0" y="0"/>
-            <wp:positionH relativeFrom="page">
-              <wp:posOffset>4886325</wp:posOffset>
-            </wp:positionH>
-            <wp:positionV relativeFrom="page">
-              <wp:posOffset>352425</wp:posOffset>
-            </wp:positionV>
-            <wp:extent cx="2487124" cy="695325"/>
-            <wp:effectExtent b="0" l="0" r="0" t="0"/>
-            <wp:wrapNone/>
-            <wp:docPr id="2" name="image1.png"/>
+          <wp:inline>
+            <wp:extent cx="5303520" cy="9727630"/>
+            <wp:docPr id="1" name="Picture 1"/>
+            <wp:cNvGraphicFramePr>
+              <a:graphicFrameLocks noChangeAspect="1"/>
+            </wp:cNvGraphicFramePr>
             <a:graphic>
               <a:graphicData uri="http://schemas.openxmlformats.org/drawingml/2006/picture">
                 <pic:pic>
                   <pic:nvPicPr>
-                    <pic:cNvPr id="0" name="image1.png"/>
-                    <pic:cNvPicPr preferRelativeResize="0"/>
+                    <pic:cNvPr id="0" name="system-flow.png"/>
+                    <pic:cNvPicPr/>
                   </pic:nvPicPr>
                   <pic:blipFill>
-                    <a:blip r:embed="rId6"/>
-                    <a:srcRect b="0" l="0" r="0" t="0"/>
+                    <a:blip r:embed="rId8"/>
                     <a:stretch>
                       <a:fillRect/>
                     </a:stretch>
@@ -50,230 +202,15 @@
                   <pic:spPr>
                     <a:xfrm>
                       <a:off x="0" y="0"/>
-                      <a:ext cx="2487124" cy="695325"/>
+                      <a:ext cx="5303520" cy="9727630"/>
                     </a:xfrm>
                     <a:prstGeom prst="rect"/>
-                    <a:ln/>
                   </pic:spPr>
                 </pic:pic>
               </a:graphicData>
             </a:graphic>
-          </wp:anchor>
+          </wp:inline>
         </w:drawing>
-      </w:r>
-      <w:r>
-        <w:rPr>
-          <w:rFonts w:ascii="Open Sans Light" w:cs="Open Sans Light" w:eastAsia="Open Sans Light" w:hAnsi="Open Sans Light"/>
-          <w:sz w:val="88"/>
-          <w:szCs w:val="88"/>
-          <w:rtl w:val="0"/>
-        </w:rPr>
-        <w:t xml:space="preserve">Agentic Expense Reporting System</w:t>
-      </w:r>
-    </w:p>
-    <w:p>
-      <w:pPr>
-        <w:rPr>
-          <w:color w:val="ff0000"/>
-        </w:rPr>
-      </w:pPr>
-      <w:r>
-        <w:rPr>
-          <w:rtl w:val="0"/>
-        </w:rPr>
-        <w:t xml:space="preserve">Presented by: </w:t>
-      </w:r>
-      <w:r>
-        <w:rPr>
-          <w:color w:val="ff0000"/>
-          <w:rtl w:val="0"/>
-        </w:rPr>
-        <w:t>Mayur Hulke</w:t>
-      </w:r>
-    </w:p>
-    <w:p>
-      <w:r>
-        <w:t>Project repository: https://github.com/MayurHulke/agentic-expense-reporting</w:t>
-      </w:r>
-    </w:p>
-    <w:p>
-      <w:pPr>
-        <w:rPr>
-          <w:rFonts w:ascii="Open Sans" w:cs="Open Sans" w:eastAsia="Open Sans" w:hAnsi="Open Sans"/>
-        </w:rPr>
-      </w:pPr>
-      <w:r>
-        <w:rPr>
-          <w:rFonts w:ascii="Open Sans" w:cs="Open Sans" w:eastAsia="Open Sans" w:hAnsi="Open Sans"/>
-        </w:rPr>
-        <mc:AlternateContent>
-          <mc:Choice Requires="wpg">
-            <w:drawing>
-              <wp:inline distB="114300" distT="114300" distL="114300" distR="114300">
-                <wp:extent cx="5943600" cy="12700"/>
-                <wp:effectExtent b="0" l="0" r="0" t="0"/>
-                <wp:docPr id="1" name=""/>
-                <a:graphic>
-                  <a:graphicData uri="http://schemas.microsoft.com/office/word/2010/wordprocessingShape">
-                    <wps:wsp>
-                      <wps:cNvCnPr/>
-                      <wps:spPr>
-                        <a:xfrm>
-                          <a:off x="-1285800" y="2447925"/>
-                          <a:ext cx="8143800" cy="0"/>
-                        </a:xfrm>
-                        <a:prstGeom prst="straightConnector1">
-                          <a:avLst/>
-                        </a:prstGeom>
-                        <a:noFill/>
-                        <a:ln cap="flat" cmpd="sng" w="28575">
-                          <a:solidFill>
-                            <a:srgbClr val="666666"/>
-                          </a:solidFill>
-                          <a:prstDash val="solid"/>
-                          <a:round/>
-                          <a:headEnd len="med" w="med" type="none"/>
-                          <a:tailEnd len="med" w="med" type="none"/>
-                        </a:ln>
-                      </wps:spPr>
-                      <wps:bodyPr anchorCtr="0" anchor="ctr" bIns="91425" lIns="91425" spcFirstLastPara="1" rIns="91425" wrap="square" tIns="91425">
-                        <a:noAutofit/>
-                      </wps:bodyPr>
-                    </wps:wsp>
-                  </a:graphicData>
-                </a:graphic>
-              </wp:inline>
-            </w:drawing>
-          </mc:Choice>
-          <mc:Fallback>
-            <w:drawing>
-              <wp:inline distB="114300" distT="114300" distL="114300" distR="114300">
-                <wp:extent cx="5943600" cy="12700"/>
-                <wp:effectExtent b="0" l="0" r="0" t="0"/>
-                <wp:docPr id="1" name="image2.png"/>
-                <a:graphic>
-                  <a:graphicData uri="http://schemas.openxmlformats.org/drawingml/2006/picture">
-                    <pic:pic>
-                      <pic:nvPicPr>
-                        <pic:cNvPr id="0" name="image2.png"/>
-                        <pic:cNvPicPr preferRelativeResize="0"/>
-                      </pic:nvPicPr>
-                      <pic:blipFill>
-                        <a:blip r:embed="rId7"/>
-                        <a:srcRect/>
-                        <a:stretch>
-                          <a:fillRect/>
-                        </a:stretch>
-                      </pic:blipFill>
-                      <pic:spPr>
-                        <a:xfrm>
-                          <a:off x="0" y="0"/>
-                          <a:ext cx="5943600" cy="12700"/>
-                        </a:xfrm>
-                        <a:prstGeom prst="rect"/>
-                        <a:ln/>
-                      </pic:spPr>
-                    </pic:pic>
-                  </a:graphicData>
-                </a:graphic>
-              </wp:inline>
-            </w:drawing>
-          </mc:Fallback>
-        </mc:AlternateContent>
-      </w:r>
-      <w:r>
-        <w:rPr>
-          <w:rtl w:val="0"/>
-        </w:rPr>
-      </w:r>
-    </w:p>
-    <w:p>
-      <w:pPr>
-        <w:pStyle w:val="Heading1"/>
-        <w:spacing w:after="0" w:before="0" w:lineRule="auto"/>
-        <w:rPr>
-          <w:rFonts w:ascii="Open Sans SemiBold" w:cs="Open Sans SemiBold" w:eastAsia="Open Sans SemiBold" w:hAnsi="Open Sans SemiBold"/>
-          <w:sz w:val="34"/>
-          <w:szCs w:val="34"/>
-        </w:rPr>
-      </w:pPr>
-      <w:bookmarkStart w:colFirst="0" w:colLast="0" w:name="_7pqs3h2m85w" w:id="1"/>
-      <w:bookmarkEnd w:id="1"/>
-      <w:r>
-        <w:rPr>
-          <w:rFonts w:ascii="Open Sans SemiBold" w:cs="Open Sans SemiBold" w:eastAsia="Open Sans SemiBold" w:hAnsi="Open Sans SemiBold"/>
-          <w:color w:val="ffffff"/>
-          <w:sz w:val="24"/>
-          <w:szCs w:val="24"/>
-          <w:highlight w:val="black"/>
-          <w:rtl w:val="0"/>
-        </w:rPr>
-        <w:t xml:space="preserve"> STEP 1: </w:t>
-      </w:r>
-      <w:r>
-        <w:rPr>
-          <w:rFonts w:ascii="Open Sans SemiBold" w:cs="Open Sans SemiBold" w:eastAsia="Open Sans SemiBold" w:hAnsi="Open Sans SemiBold"/>
-          <w:color w:val="02b3e4"/>
-          <w:sz w:val="24"/>
-          <w:szCs w:val="24"/>
-          <w:rtl w:val="0"/>
-        </w:rPr>
-        <w:t xml:space="preserve"> </w:t>
-      </w:r>
-      <w:r>
-        <w:rPr>
-          <w:rFonts w:ascii="Open Sans SemiBold" w:cs="Open Sans SemiBold" w:eastAsia="Open Sans SemiBold" w:hAnsi="Open Sans SemiBold"/>
-          <w:sz w:val="34"/>
-          <w:szCs w:val="34"/>
-          <w:rtl w:val="0"/>
-        </w:rPr>
-        <w:t xml:space="preserve">Review the Current System Documentation</w:t>
-      </w:r>
-    </w:p>
-    <w:p>
-      <w:pPr>
-        <w:rPr/>
-      </w:pPr>
-      <w:r>
-        <w:rPr>
-          <w:rtl w:val="0"/>
-        </w:rPr>
-        <w:t xml:space="preserve">No written response needed.</w:t>
-      </w:r>
-      <w:r>
-        <w:rPr>
-          <w:rtl w:val="0"/>
-        </w:rPr>
-      </w:r>
-    </w:p>
-    <w:p>
-      <w:pPr>
-        <w:pStyle w:val="Heading1"/>
-        <w:spacing w:after="0" w:before="0" w:lineRule="auto"/>
-        <w:rPr>
-          <w:rFonts w:ascii="Open Sans SemiBold" w:cs="Open Sans SemiBold" w:eastAsia="Open Sans SemiBold" w:hAnsi="Open Sans SemiBold"/>
-          <w:color w:val="ffffff"/>
-          <w:sz w:val="24"/>
-          <w:szCs w:val="24"/>
-          <w:highlight w:val="black"/>
-        </w:rPr>
-      </w:pPr>
-      <w:bookmarkStart w:colFirst="0" w:colLast="0" w:name="_m5nw8ml1n451" w:id="2"/>
-      <w:bookmarkEnd w:id="2"/>
-      <w:r>
-        <w:rPr>
-          <w:rtl w:val="0"/>
-        </w:rPr>
-      </w:r>
-    </w:p>
-    <w:p>
-      <w:pPr>
-        <w:rPr/>
-      </w:pPr>
-      <w:r>
-        <w:rPr>
-          <w:rtl w:val="0"/>
-        </w:rPr>
       </w:r>
     </w:p>
     <w:p>

</xml_diff>

<commit_message>
Signpost the reference implementation and frontier architecture
- responses.md: add 'Implementation and Frontier Architecture' closing section
- submission .docx: one pointer line under the repo link (rubric cells unchanged)
</commit_message>
<xml_diff>
--- a/docs/submission/Agentic-Expense-Reporting-System-Mayur-Hulke.docx
+++ b/docs/submission/Agentic-Expense-Reporting-System-Mayur-Hulke.docx
@@ -54,6 +54,11 @@
     <w:p>
       <w:r>
         <w:t>Project repository: https://github.com/MayurHulke/agentic-expense-reporting</w:t>
+      </w:r>
+    </w:p>
+    <w:p>
+      <w:r>
+        <w:t>Backed by a runnable reference implementation, including a working Model Context Protocol integration and a 2026 frontier-methods architecture. See the repository and docs/mcp.md.</w:t>
       </w:r>
     </w:p>
     <w:p>

</xml_diff>